<commit_message>
Docs: bring README, deployment guide and defense report up to final state
Co-Authored-By: Claude Opus 5 (1M context) <noreply@anthropic.com>
Claude-Session: https://claude.ai/code/session_01UKRbXq1FH3t1w2pD5c8Jk2
</commit_message>
<xml_diff>
--- a/CropSense_Defense_Report.docx
+++ b/CropSense_Defense_Report.docx
@@ -195,7 +195,7 @@
               <w:rPr>
                 <w:sz w:val="18"/>
               </w:rPr>
-              <w:t>1,592 across 51 classes</w:t>
+              <w:t>1,593 across 51 classes</w:t>
             </w:r>
           </w:p>
         </w:tc>
@@ -331,7 +331,7 @@
               <w:rPr>
                 <w:sz w:val="18"/>
               </w:rPr>
-              <w:t>Repository branch main, commit e70df98</w:t>
+              <w:t>Repository branch main, commit 79c0e33 — deployed live on Hugging Face Spaces and Vercel</w:t>
             </w:r>
           </w:p>
         </w:tc>
@@ -1788,7 +1788,7 @@
               <w:rPr>
                 <w:sz w:val="18"/>
               </w:rPr>
-              <w:t>1,592</w:t>
+              <w:t>1,593</w:t>
             </w:r>
           </w:p>
         </w:tc>
@@ -5444,125 +5444,8 @@
                 <w:sz w:val="17"/>
               </w:rPr>
               <w:t>MUST KNOW — CURRENT DEPLOYMENT STATE</w:t>
-            </w:r>
-          </w:p>
-          <w:p>
-            <w:pPr>
-              <w:spacing w:after="40"/>
-            </w:pPr>
-            <w:r>
-              <w:rPr>
-                <w:sz w:val="20"/>
-              </w:rPr>
-              <w:t xml:space="preserve">Open-set rejection is </w:t>
-            </w:r>
-            <w:r>
-              <w:rPr>
-                <w:b/>
-                <w:sz w:val="20"/>
-              </w:rPr>
-              <w:t>currently inactive</w:t>
-            </w:r>
-            <w:r>
-              <w:rPr>
-                <w:sz w:val="20"/>
-              </w:rPr>
-              <w:t xml:space="preserve">. The backend defaults to </w:t>
-            </w:r>
-            <w:r>
-              <w:rPr>
-                <w:rFonts w:ascii="Consolas" w:hAnsi="Consolas"/>
-                <w:color w:val="33443A"/>
-                <w:sz w:val="20"/>
-              </w:rPr>
-              <w:t>MODEL_PATH=last_final_model</w:t>
-            </w:r>
-            <w:r>
-              <w:rPr>
-                <w:sz w:val="20"/>
-              </w:rPr>
-              <w:t xml:space="preserve">, and that folder ships its statistics file as </w:t>
-            </w:r>
-            <w:r>
-              <w:rPr>
-                <w:rFonts w:ascii="Consolas" w:hAnsi="Consolas"/>
-                <w:color w:val="33443A"/>
-                <w:sz w:val="20"/>
-              </w:rPr>
-              <w:t>odd_stats.npz</w:t>
-            </w:r>
-            <w:r>
-              <w:rPr>
-                <w:sz w:val="20"/>
-              </w:rPr>
-              <w:t xml:space="preserve"> — a typo of </w:t>
-            </w:r>
-            <w:r>
-              <w:rPr>
-                <w:rFonts w:ascii="Consolas" w:hAnsi="Consolas"/>
-                <w:color w:val="33443A"/>
-                <w:sz w:val="20"/>
-              </w:rPr>
-              <w:t>ood_stats.npz</w:t>
-            </w:r>
-            <w:r>
-              <w:rPr>
-                <w:sz w:val="20"/>
-              </w:rPr>
-              <w:t xml:space="preserve">, which is the exact filename </w:t>
-            </w:r>
-            <w:r>
-              <w:rPr>
-                <w:rFonts w:ascii="Consolas" w:hAnsi="Consolas"/>
-                <w:color w:val="33443A"/>
-                <w:sz w:val="20"/>
-              </w:rPr>
-              <w:t>main.py</w:t>
-            </w:r>
-            <w:r>
-              <w:rPr>
-                <w:sz w:val="20"/>
-              </w:rPr>
-              <w:t xml:space="preserve"> looks for. The file’s contents are also the wrong schema (four scalars: mean, std, min, threshold) rather than the expected 51×512 centroid array. So condition 5 never fires today; conditions 1–4 still do.</w:t>
-            </w:r>
-          </w:p>
-          <w:p>
-            <w:pPr>
-              <w:spacing w:after="0"/>
-            </w:pPr>
-            <w:r>
-              <w:rPr>
-                <w:sz w:val="20"/>
-              </w:rPr>
-              <w:t xml:space="preserve">The previous checkpoint, </w:t>
-            </w:r>
-            <w:r>
-              <w:rPr>
-                <w:rFonts w:ascii="Consolas" w:hAnsi="Consolas"/>
-                <w:color w:val="33443A"/>
-                <w:sz w:val="20"/>
-              </w:rPr>
-              <w:t>final_field_Model/</w:t>
-            </w:r>
-            <w:r>
-              <w:rPr>
-                <w:sz w:val="20"/>
-              </w:rPr>
-              <w:t xml:space="preserve">, has a valid </w:t>
-            </w:r>
-            <w:r>
-              <w:rPr>
-                <w:rFonts w:ascii="Consolas" w:hAnsi="Consolas"/>
-                <w:color w:val="33443A"/>
-                <w:sz w:val="20"/>
-              </w:rPr>
-              <w:t>ood_stats.npz</w:t>
-            </w:r>
-            <w:r>
-              <w:rPr>
-                <w:sz w:val="20"/>
-              </w:rPr>
-              <w:t xml:space="preserve"> (51 centroids × 512 dims, threshold 0.6764). Centroids are only valid against the weights they were computed from, so the fix is to re-export from the same run — not to copy the old file across. See section 14.</w:t>
+              <w:br/>
+              <w:t>Open-set rejection is live. last_final_model/ood_stats.npz holds 51 L2-normalised centroids of 512 dimensions with threshold τ = 0.5596, computed from the same run as the deployed weights, and start-up logs “Open-set rejection enabled: 51 centroids, threshold 0.5596”. An earlier checkpoint shipped the file mis-named (odd_stats.npz) and with the wrong schema, which silently disabled the rule — the fix was to regenerate it from the matching run, never to copy an older file, because centroids are only meaningful against the weights they were computed from. Measured effectiveness is a separate matter: see section 13.6.</w:t>
             </w:r>
           </w:p>
         </w:tc>
@@ -7807,18 +7690,7 @@
     </w:p>
     <w:p>
       <w:r>
-        <w:t xml:space="preserve">React Native on Expo SDK 54 (RN 0.81.5, React 19.1). A deliberately thin client: it calls the same </w:t>
-      </w:r>
-      <w:r>
-        <w:rPr>
-          <w:rFonts w:ascii="Consolas" w:hAnsi="Consolas"/>
-          <w:color w:val="33443A"/>
-          <w:sz w:val="19"/>
-        </w:rPr>
-        <w:t>/predict</w:t>
-      </w:r>
-      <w:r>
-        <w:t xml:space="preserve"> endpoint and holds no inference logic of its own.</w:t>
+        <w:t>React Native on Expo SDK 57 (RN 0.86.3, React 19.2). A deliberately thin client: it calls the same /predict endpoint and holds no inference logic of its own. The crop selector is optional and defaults to “Any crop”, so a photo can be analysed in two taps.</w:t>
       </w:r>
     </w:p>
     <w:p>
@@ -7854,10 +7726,7 @@
         <w:rPr>
           <w:b/>
         </w:rPr>
-        <w:t>Crop chips</w:t>
-      </w:r>
-      <w:r>
-        <w:t xml:space="preserve"> mirroring the web selector, and the same duplicate-submit ref guard.</w:t>
+        <w:t>Crop chips mirroring the web selector — optional, defaulting to “Any crop”, which sends no crop_type and therefore only disables the mismatch warning — and the same duplicate-submit ref guard.</w:t>
       </w:r>
     </w:p>
     <w:p>
@@ -7920,38 +7789,7 @@
     </w:p>
     <w:p>
       <w:r>
-        <w:t xml:space="preserve">The backend address is compiled in from </w:t>
-      </w:r>
-      <w:r>
-        <w:rPr>
-          <w:rFonts w:ascii="Consolas" w:hAnsi="Consolas"/>
-          <w:color w:val="33443A"/>
-          <w:sz w:val="19"/>
-        </w:rPr>
-        <w:t>config.js</w:t>
-      </w:r>
-      <w:r>
-        <w:t xml:space="preserve">, overridable with </w:t>
-      </w:r>
-      <w:r>
-        <w:rPr>
-          <w:rFonts w:ascii="Consolas" w:hAnsi="Consolas"/>
-          <w:color w:val="33443A"/>
-          <w:sz w:val="19"/>
-        </w:rPr>
-        <w:t>EXPO_PUBLIC_API_URL</w:t>
-      </w:r>
-      <w:r>
-        <w:t xml:space="preserve">. The committed default is a </w:t>
-      </w:r>
-      <w:r>
-        <w:rPr>
-          <w:b/>
-        </w:rPr>
-        <w:t>Tailscale</w:t>
-      </w:r>
-      <w:r>
-        <w:t xml:space="preserve"> tailnet address, which lets the phone reach a laptop-hosted backend from any network — mobile data included — provided the phone has Tailscale installed and signed in. For plain same-Wi-Fi testing you override with the laptop’s LAN IP:</w:t>
+        <w:t>The backend address is compiled in from config.js, overridable with EXPO_PUBLIC_API_URL. The committed default is the public Hugging Face Space (https://bikkii-cropsense.hf.space), so an installed APK works on any phone, on mobile data, with no laptop running. The default lives in code rather than .env.local because EAS cloud builds ignore gitignored environment files. For local testing against a laptop backend on the same Wi-Fi:</w:t>
       </w:r>
     </w:p>
     <w:p>
@@ -8052,58 +7890,8 @@
                 <w:sz w:val="17"/>
               </w:rPr>
               <w:t>DEMO-DAY CHECK</w:t>
-            </w:r>
-          </w:p>
-          <w:p>
-            <w:pPr>
-              <w:spacing w:after="0"/>
-            </w:pPr>
-            <w:r>
-              <w:rPr>
-                <w:sz w:val="20"/>
-              </w:rPr>
-              <w:t xml:space="preserve">Before presenting, open </w:t>
-            </w:r>
-            <w:r>
-              <w:rPr>
-                <w:rFonts w:ascii="Consolas" w:hAnsi="Consolas"/>
-                <w:color w:val="33443A"/>
-                <w:sz w:val="20"/>
-              </w:rPr>
-              <w:t>http://&lt;backend-ip&gt;:8000/health</w:t>
-            </w:r>
-            <w:r>
-              <w:rPr>
-                <w:sz w:val="20"/>
-              </w:rPr>
-              <w:t xml:space="preserve"> in the </w:t>
-            </w:r>
-            <w:r>
-              <w:rPr>
-                <w:b/>
-                <w:sz w:val="20"/>
-              </w:rPr>
-              <w:t>phone’s own browser</w:t>
-            </w:r>
-            <w:r>
-              <w:rPr>
-                <w:sz w:val="20"/>
-              </w:rPr>
-              <w:t xml:space="preserve">. If that returns JSON, the app will work; if it does not, no amount of app debugging will help. Ship an APK built with </w:t>
-            </w:r>
-            <w:r>
-              <w:rPr>
-                <w:rFonts w:ascii="Consolas" w:hAnsi="Consolas"/>
-                <w:color w:val="33443A"/>
-                <w:sz w:val="20"/>
-              </w:rPr>
-              <w:t>npx eas-cli build -p android --profile preview</w:t>
-            </w:r>
-            <w:r>
-              <w:rPr>
-                <w:sz w:val="20"/>
-              </w:rPr>
-              <w:t xml:space="preserve"> as a fallback so the demo does not depend on Metro and a QR code.</w:t>
+              <w:br/>
+              <w:t>Open https://bikkii-cropsense.hf.space/health in the phone’s own browser a few minutes before presenting. If that returns JSON the app will work; if it does not, no amount of app debugging will help. The free Space sleeps when idle, so this also wakes it. The installed APK (eas build -p android --profile preview) removes any dependence on Metro, Expo Go or a QR code, and docker compose up --build is the offline fallback if the venue has no internet.</w:t>
             </w:r>
           </w:p>
         </w:tc>
@@ -8508,17 +8296,8 @@
           <w:sz w:val="18"/>
         </w:rPr>
         <w:t>git lfs pull                 # model weights are LFS pointers until you do</w:t>
-      </w:r>
-      <w:r>
         <w:br/>
-      </w:r>
-      <w:r>
-        <w:rPr>
-          <w:rFonts w:ascii="Consolas" w:hAnsi="Consolas"/>
-          <w:color w:val="2A352E"/>
-          <w:sz w:val="18"/>
-        </w:rPr>
-        <w:t>docker compose up --build</w:t>
+        <w:t>docker compose up --build    # local full stack: db, backend, web, adminer</w:t>
       </w:r>
     </w:p>
     <w:tbl>
@@ -9005,6 +8784,11 @@
       </w:r>
     </w:p>
     <w:p>
+      <w:r>
+        <w:t>As deployed today: the API and the 102 MB weights file (Git LFS) run in a Hugging Face Space at https://bikkii-cropsense.hf.space, the React client is served by Vercel and redeploys on every push to main, and the Android client ships as a signed APK from Expo EAS Build. Hugging Face moved Docker Spaces to a paid tier during the project, so the service runs on the free Gradio SDK: app.py mounts the FastAPI routes on gr.Server and starts through Gradio’s own launcher, which is what ZeroGPU requires — a self-started uvicorn fails with ‘address already in use’ on port 7860. The model runs on CPU; the Space sleeps when idle and wakes on the first request.</w:t>
+      </w:r>
+    </w:p>
+    <w:p>
       <w:pPr>
         <w:pStyle w:val="Heading2"/>
       </w:pPr>
@@ -9078,44 +8862,8 @@
                 <w:sz w:val="17"/>
               </w:rPr>
               <w:t>READ THIS BEFORE QUOTING ANY NUMBER</w:t>
-            </w:r>
-          </w:p>
-          <w:p>
-            <w:pPr>
-              <w:spacing w:after="0"/>
-            </w:pPr>
-            <w:r>
-              <w:rPr>
-                <w:sz w:val="20"/>
-              </w:rPr>
-              <w:t xml:space="preserve">Both training notebooks in the repository have </w:t>
-            </w:r>
-            <w:r>
-              <w:rPr>
-                <w:b/>
-                <w:sz w:val="20"/>
-              </w:rPr>
-              <w:t>zero saved cell outputs</w:t>
-            </w:r>
-            <w:r>
-              <w:rPr>
-                <w:sz w:val="20"/>
-              </w:rPr>
-              <w:t xml:space="preserve">. There is no stored classification report, no macro-F1 figure, and no field-only accuracy score for the currently deployed checkpoint. The only saved artifacts are two PNGs in </w:t>
-            </w:r>
-            <w:r>
-              <w:rPr>
-                <w:rFonts w:ascii="Consolas" w:hAnsi="Consolas"/>
-                <w:color w:val="33443A"/>
-                <w:sz w:val="20"/>
-              </w:rPr>
-              <w:t>backend/Final_Model/</w:t>
-            </w:r>
-            <w:r>
-              <w:rPr>
-                <w:sz w:val="20"/>
-              </w:rPr>
-              <w:t xml:space="preserve"> from a run dated 31 Aug 2026. Quote those as what they are, and do not attribute them to the deployed model.</w:t>
+              <w:br/>
+              <w:t>Both training notebooks have zero saved cell outputs, so there is no stored classification report or macro-F1 for the deployed checkpoint. The saved curves and confusion matrix come from the 31 Aug 2026 51-class laboratory run — quote them as that, never as the deployed model. The numbers that do describe the deployed model are the independent PlantDoc results in section 13.6, measured through the live API.</w:t>
             </w:r>
           </w:p>
         </w:tc>
@@ -9420,16 +9168,7 @@
         <w:pStyle w:val="ListBullet"/>
       </w:pPr>
       <w:r>
-        <w:t xml:space="preserve">It is a </w:t>
-      </w:r>
-      <w:r>
-        <w:rPr>
-          <w:b/>
-        </w:rPr>
-        <w:t>lab-set</w:t>
-      </w:r>
-      <w:r>
-        <w:t xml:space="preserve"> test score. ~98–99% on a curated lab split is the well-known inflated figure that PlantVillage-style datasets produce, and it is not what a farmer will experience in a field. The number that matters is the field-only score, and that is exactly the number the repository does not currently have saved.</w:t>
+        <w:t>It is a lab-set test score. ~98–99% on a curated lab split is the well-known inflated figure that PlantVillage-style datasets produce, and it is not what a farmer experiences in a field. The field number now exists and is reported in section 13.6: 48.0% top-1 on independent PlantDoc photographs, measured through the deployed API.</w:t>
       </w:r>
     </w:p>
     <w:p>
@@ -9662,7 +9401,7 @@
               <w:rPr>
                 <w:sz w:val="18"/>
               </w:rPr>
-              <w:t>Needs HOLDOUT_UNTRAINED set — currently None</w:t>
+              <w:t>Run on PlantDoc instead — see 13.6 (28.4% of untrained crops declined)</w:t>
             </w:r>
           </w:p>
         </w:tc>
@@ -9810,16 +9549,7 @@
     </w:p>
     <w:p>
       <w:r>
-        <w:t xml:space="preserve">The frontend test suite runs green: </w:t>
-      </w:r>
-      <w:r>
-        <w:rPr>
-          <w:b/>
-        </w:rPr>
-        <w:t>16 tests across 3 files, all passing</w:t>
-      </w:r>
-      <w:r>
-        <w:t xml:space="preserve"> (Vitest 3.2.7 + React Testing Library, jsdom). Coverage targets the logic most worth protecting rather than chasing a percentage:</w:t>
+        <w:t>The frontend test suite runs green: 24 tests across 5 files, all passing (Vitest 3.2 + React Testing Library, jsdom). ESLint reports no problems and the production build succeeds. Coverage targets the logic most worth protecting rather than chasing a percentage:</w:t>
       </w:r>
     </w:p>
     <w:tbl>
@@ -9924,7 +9654,7 @@
               <w:rPr>
                 <w:sz w:val="18"/>
               </w:rPr>
-              <w:t>8</w:t>
+              <w:t>10</w:t>
             </w:r>
           </w:p>
         </w:tc>
@@ -10043,6 +9773,159 @@
                 <w:sz w:val="18"/>
               </w:rPr>
               <w:t>Responsible wording, the Grad-CAM note, the uncertainty warning, feedback controls</w:t>
+            </w:r>
+          </w:p>
+        </w:tc>
+      </w:tr>
+      <w:tr>
+        <w:tc>
+          <w:tcPr>
+            <w:tcW w:type="dxa" w:w="2736"/>
+          </w:tcPr>
+          <w:p>
+            <w:pPr>
+              <w:spacing w:after="20" w:before="20"/>
+            </w:pPr>
+            <w:r>
+              <w:rPr>
+                <w:rFonts w:ascii="Consolas" w:hAnsi="Consolas"/>
+                <w:sz w:val="17"/>
+              </w:rPr>
+              <w:t>components/ImagePicker.test.jsx</w:t>
+            </w:r>
+          </w:p>
+        </w:tc>
+        <w:tc>
+          <w:tcPr>
+            <w:tcW w:type="dxa" w:w="864"/>
+          </w:tcPr>
+          <w:p>
+            <w:pPr>
+              <w:spacing w:after="20" w:before="20"/>
+            </w:pPr>
+            <w:r>
+              <w:rPr>
+                <w:sz w:val="18"/>
+              </w:rPr>
+              <w:t>3</w:t>
+            </w:r>
+          </w:p>
+        </w:tc>
+        <w:tc>
+          <w:tcPr>
+            <w:tcW w:type="dxa" w:w="5400"/>
+          </w:tcPr>
+          <w:p>
+            <w:pPr>
+              <w:spacing w:after="20" w:before="20"/>
+            </w:pPr>
+            <w:r>
+              <w:rPr>
+                <w:sz w:val="18"/>
+              </w:rPr>
+              <w:t>Photo selection, preview and guidance behaviour</w:t>
+            </w:r>
+          </w:p>
+        </w:tc>
+      </w:tr>
+      <w:tr>
+        <w:tc>
+          <w:tcPr>
+            <w:tcW w:type="dxa" w:w="2736"/>
+          </w:tcPr>
+          <w:p>
+            <w:pPr>
+              <w:spacing w:after="20" w:before="20"/>
+            </w:pPr>
+            <w:r>
+              <w:rPr>
+                <w:rFonts w:ascii="Consolas" w:hAnsi="Consolas"/>
+                <w:sz w:val="17"/>
+              </w:rPr>
+              <w:t>pages/History.test.jsx</w:t>
+            </w:r>
+          </w:p>
+        </w:tc>
+        <w:tc>
+          <w:tcPr>
+            <w:tcW w:type="dxa" w:w="864"/>
+          </w:tcPr>
+          <w:p>
+            <w:pPr>
+              <w:spacing w:after="20" w:before="20"/>
+            </w:pPr>
+            <w:r>
+              <w:rPr>
+                <w:sz w:val="18"/>
+              </w:rPr>
+              <w:t>3</w:t>
+            </w:r>
+          </w:p>
+        </w:tc>
+        <w:tc>
+          <w:tcPr>
+            <w:tcW w:type="dxa" w:w="5400"/>
+          </w:tcPr>
+          <w:p>
+            <w:pPr>
+              <w:spacing w:after="20" w:before="20"/>
+            </w:pPr>
+            <w:r>
+              <w:rPr>
+                <w:sz w:val="18"/>
+              </w:rPr>
+              <w:t>Delete-all control visibility, confirmation and clearing</w:t>
+            </w:r>
+          </w:p>
+        </w:tc>
+      </w:tr>
+      <w:tr>
+        <w:tc>
+          <w:tcPr>
+            <w:tcW w:type="dxa" w:w="2736"/>
+          </w:tcPr>
+          <w:p>
+            <w:pPr>
+              <w:spacing w:after="20" w:before="20"/>
+            </w:pPr>
+            <w:r>
+              <w:rPr>
+                <w:rFonts w:ascii="Consolas" w:hAnsi="Consolas"/>
+                <w:sz w:val="17"/>
+              </w:rPr>
+              <w:t>Total</w:t>
+            </w:r>
+          </w:p>
+        </w:tc>
+        <w:tc>
+          <w:tcPr>
+            <w:tcW w:type="dxa" w:w="864"/>
+          </w:tcPr>
+          <w:p>
+            <w:pPr>
+              <w:spacing w:after="20" w:before="20"/>
+            </w:pPr>
+            <w:r>
+              <w:rPr>
+                <w:sz w:val="18"/>
+              </w:rPr>
+              <w:t>24</w:t>
+            </w:r>
+          </w:p>
+        </w:tc>
+        <w:tc>
+          <w:tcPr>
+            <w:tcW w:type="dxa" w:w="5400"/>
+          </w:tcPr>
+          <w:p>
+            <w:pPr>
+              <w:spacing w:after="20" w:before="20"/>
+            </w:pPr>
+            <w:r>
+              <w:rPr>
+                <w:sz w:val="18"/>
+              </w:rPr>
+              <w:t>All passing (Vitest run, 16 September 2026)</w:t>
             </w:r>
           </w:p>
         </w:tc>
@@ -10074,7 +9957,7 @@
         <w:pStyle w:val="Heading2"/>
       </w:pPr>
       <w:r>
-        <w:t>13.5  What to generate before the defense, if there is time</w:t>
+        <w:t>13.5  Still worth generating, if there is time</w:t>
       </w:r>
     </w:p>
     <w:p>
@@ -10082,16 +9965,7 @@
         <w:pStyle w:val="ListNumber"/>
       </w:pPr>
       <w:r>
-        <w:t xml:space="preserve">Re-run the notebook end to end </w:t>
-      </w:r>
-      <w:r>
-        <w:rPr>
-          <w:b/>
-        </w:rPr>
-        <w:t>and save the outputs</w:t>
-      </w:r>
-      <w:r>
-        <w:t>, so per-class F1 and the field-only score exist for the deployed checkpoint.</w:t>
+        <w:t>Re-run the notebook end to end with outputs preserved, so per-class F1 and the internal field-only score exist for the deployed checkpoint as well. The independent PlantDoc evaluation (13.6) covers the headline field numbers in the meantime.</w:t>
       </w:r>
     </w:p>
     <w:p>
@@ -10099,18 +9973,7 @@
         <w:pStyle w:val="ListNumber"/>
       </w:pPr>
       <w:r>
-        <w:t xml:space="preserve">Set </w:t>
-      </w:r>
-      <w:r>
-        <w:rPr>
-          <w:rFonts w:ascii="Consolas" w:hAnsi="Consolas"/>
-          <w:color w:val="33443A"/>
-          <w:sz w:val="19"/>
-        </w:rPr>
-        <w:t>HOLDOUT_UNTRAINED</w:t>
-      </w:r>
-      <w:r>
-        <w:t xml:space="preserve"> to a folder of leaves from crops kept entirely out of training (guava, papaya, coffee) and record the rejection rate. This is the single number that proves the Unknown machinery works.</w:t>
+        <w:t>Record the rejection rate on a larger held-out set of untrained crops. PlantDoc supplied 74 such leaves; a purpose-built set would tighten the estimate.</w:t>
       </w:r>
     </w:p>
     <w:p>
@@ -10118,18 +9981,322 @@
         <w:pStyle w:val="ListNumber"/>
       </w:pPr>
       <w:r>
-        <w:t xml:space="preserve">Re-export </w:t>
-      </w:r>
-      <w:r>
-        <w:rPr>
-          <w:rFonts w:ascii="Consolas" w:hAnsi="Consolas"/>
-          <w:color w:val="33443A"/>
-          <w:sz w:val="19"/>
-        </w:rPr>
-        <w:t>ood_stats.npz</w:t>
-      </w:r>
-      <w:r>
-        <w:t xml:space="preserve"> from that same run, correctly named, so open-set rejection is actually live in the demo.</w:t>
+        <w:t>Re-calibrate the open-set threshold on field rather than in-domain validation images — section 13.6 shows the calibrated 5% false-rejection rate rises to 11.5% across the domain gap.</w:t>
+      </w:r>
+    </w:p>
+    <w:p>
+      <w:pPr>
+        <w:pStyle w:val="Heading2"/>
+      </w:pPr>
+      <w:r>
+        <w:t>13.6  Independent field evaluation on PlantDoc</w:t>
+      </w:r>
+    </w:p>
+    <w:p>
+      <w:r>
+        <w:t>Because the deployed run’s notebook outputs were not preserved, the model was evaluated independently through the live /predict endpoint — including leaf cropping, the leaf pre-check and the Unknown gate — on the PlantDoc test split (Singh et al., 2020). Every PlantDoc image was hashed against all 1,593 CropSense field images and 10 near-duplicates removed, leaving 226: 148 of supported classes, 74 of crops the model was never trained on, and 4 of an unsupported maize disease. No crop was specified, matching the “Any crop” option.</w:t>
+      </w:r>
+    </w:p>
+    <w:tbl>
+      <w:tblPr>
+        <w:tblStyle w:val="TableGrid"/>
+        <w:tblW w:type="auto" w:w="0"/>
+        <w:tblLook w:firstColumn="1" w:firstRow="1" w:lastColumn="0" w:lastRow="0" w:noHBand="0" w:noVBand="1" w:val="04A0"/>
+      </w:tblPr>
+      <w:tblGrid>
+        <w:gridCol w:w="4514"/>
+        <w:gridCol w:w="4514"/>
+      </w:tblGrid>
+      <w:tr>
+        <w:tc>
+          <w:tcPr>
+            <w:tcW w:type="dxa" w:w="4514"/>
+          </w:tcPr>
+          <w:p>
+            <w:r>
+              <w:t>Metric (supported classes, n = 148)</w:t>
+            </w:r>
+          </w:p>
+        </w:tc>
+        <w:tc>
+          <w:tcPr>
+            <w:tcW w:type="dxa" w:w="4514"/>
+          </w:tcPr>
+          <w:p>
+            <w:r>
+              <w:t>Value</w:t>
+            </w:r>
+          </w:p>
+        </w:tc>
+      </w:tr>
+      <w:tr>
+        <w:tc>
+          <w:tcPr>
+            <w:tcW w:type="dxa" w:w="4514"/>
+          </w:tcPr>
+          <w:p>
+            <w:r>
+              <w:t>Top-1 accuracy (model)</w:t>
+            </w:r>
+          </w:p>
+        </w:tc>
+        <w:tc>
+          <w:tcPr>
+            <w:tcW w:type="dxa" w:w="4514"/>
+          </w:tcPr>
+          <w:p>
+            <w:r>
+              <w:t>48.0% (71/148)</w:t>
+            </w:r>
+          </w:p>
+        </w:tc>
+      </w:tr>
+      <w:tr>
+        <w:tc>
+          <w:tcPr>
+            <w:tcW w:type="dxa" w:w="4514"/>
+          </w:tcPr>
+          <w:p>
+            <w:r>
+              <w:t>Top-5 accuracy (model)</w:t>
+            </w:r>
+          </w:p>
+        </w:tc>
+        <w:tc>
+          <w:tcPr>
+            <w:tcW w:type="dxa" w:w="4514"/>
+          </w:tcPr>
+          <w:p>
+            <w:r>
+              <w:t>81.8% (121/148)</w:t>
+            </w:r>
+          </w:p>
+        </w:tc>
+      </w:tr>
+      <w:tr>
+        <w:tc>
+          <w:tcPr>
+            <w:tcW w:type="dxa" w:w="4514"/>
+          </w:tcPr>
+          <w:p>
+            <w:r>
+              <w:t>Correct crop in top-1</w:t>
+            </w:r>
+          </w:p>
+        </w:tc>
+        <w:tc>
+          <w:tcPr>
+            <w:tcW w:type="dxa" w:w="4514"/>
+          </w:tcPr>
+          <w:p>
+            <w:r>
+              <w:t>70.9% (105/148)</w:t>
+            </w:r>
+          </w:p>
+        </w:tc>
+      </w:tr>
+      <w:tr>
+        <w:tc>
+          <w:tcPr>
+            <w:tcW w:type="dxa" w:w="4514"/>
+          </w:tcPr>
+          <w:p>
+            <w:r>
+              <w:t>System: correct answer shown</w:t>
+            </w:r>
+          </w:p>
+        </w:tc>
+        <w:tc>
+          <w:tcPr>
+            <w:tcW w:type="dxa" w:w="4514"/>
+          </w:tcPr>
+          <w:p>
+            <w:r>
+              <w:t>43.2%</w:t>
+            </w:r>
+          </w:p>
+        </w:tc>
+      </w:tr>
+      <w:tr>
+        <w:tc>
+          <w:tcPr>
+            <w:tcW w:type="dxa" w:w="4514"/>
+          </w:tcPr>
+          <w:p>
+            <w:r>
+              <w:t>System: wrong answer shown</w:t>
+            </w:r>
+          </w:p>
+        </w:tc>
+        <w:tc>
+          <w:tcPr>
+            <w:tcW w:type="dxa" w:w="4514"/>
+          </w:tcPr>
+          <w:p>
+            <w:r>
+              <w:t>33.8%</w:t>
+            </w:r>
+          </w:p>
+        </w:tc>
+      </w:tr>
+      <w:tr>
+        <w:tc>
+          <w:tcPr>
+            <w:tcW w:type="dxa" w:w="4514"/>
+          </w:tcPr>
+          <w:p>
+            <w:r>
+              <w:t>System: declined (Crop Not Supported / Not Identified)</w:t>
+            </w:r>
+          </w:p>
+        </w:tc>
+        <w:tc>
+          <w:tcPr>
+            <w:tcW w:type="dxa" w:w="4514"/>
+          </w:tcPr>
+          <w:p>
+            <w:r>
+              <w:t>23.0%</w:t>
+            </w:r>
+          </w:p>
+        </w:tc>
+      </w:tr>
+      <w:tr>
+        <w:tc>
+          <w:tcPr>
+            <w:tcW w:type="dxa" w:w="4514"/>
+          </w:tcPr>
+          <w:p>
+            <w:r>
+              <w:t>Precision of shown results</w:t>
+            </w:r>
+          </w:p>
+        </w:tc>
+        <w:tc>
+          <w:tcPr>
+            <w:tcW w:type="dxa" w:w="4514"/>
+          </w:tcPr>
+          <w:p>
+            <w:r>
+              <w:t>56.1% (64/114)</w:t>
+            </w:r>
+          </w:p>
+        </w:tc>
+      </w:tr>
+      <w:tr>
+        <w:tc>
+          <w:tcPr>
+            <w:tcW w:type="dxa" w:w="4514"/>
+          </w:tcPr>
+          <w:p>
+            <w:r>
+              <w:t>Accuracy at ≥ 80% confidence</w:t>
+            </w:r>
+          </w:p>
+        </w:tc>
+        <w:tc>
+          <w:tcPr>
+            <w:tcW w:type="dxa" w:w="4514"/>
+          </w:tcPr>
+          <w:p>
+            <w:r>
+              <w:t>81.8%, covering 22.3% of photographs</w:t>
+            </w:r>
+          </w:p>
+        </w:tc>
+      </w:tr>
+      <w:tr>
+        <w:tc>
+          <w:tcPr>
+            <w:tcW w:type="dxa" w:w="4514"/>
+          </w:tcPr>
+          <w:p>
+            <w:r>
+              <w:t>Accuracy at ≥ 60% confidence</w:t>
+            </w:r>
+          </w:p>
+        </w:tc>
+        <w:tc>
+          <w:tcPr>
+            <w:tcW w:type="dxa" w:w="4514"/>
+          </w:tcPr>
+          <w:p>
+            <w:r>
+              <w:t>72.3%, covering 43.9% of photographs</w:t>
+            </w:r>
+          </w:p>
+        </w:tc>
+      </w:tr>
+      <w:tr>
+        <w:tc>
+          <w:tcPr>
+            <w:tcW w:type="dxa" w:w="4514"/>
+          </w:tcPr>
+          <w:p>
+            <w:r>
+              <w:t>Untrained-crop leaves declined</w:t>
+            </w:r>
+          </w:p>
+        </w:tc>
+        <w:tc>
+          <w:tcPr>
+            <w:tcW w:type="dxa" w:w="4514"/>
+          </w:tcPr>
+          <w:p>
+            <w:r>
+              <w:t>28.4% (21/74)</w:t>
+            </w:r>
+          </w:p>
+        </w:tc>
+      </w:tr>
+      <w:tr>
+        <w:tc>
+          <w:tcPr>
+            <w:tcW w:type="dxa" w:w="4514"/>
+          </w:tcPr>
+          <w:p>
+            <w:r>
+              <w:t>Open-set score, supported vs untrained (mean)</w:t>
+            </w:r>
+          </w:p>
+        </w:tc>
+        <w:tc>
+          <w:tcPr>
+            <w:tcW w:type="dxa" w:w="4514"/>
+          </w:tcPr>
+          <w:p>
+            <w:r>
+              <w:t>0.701 vs 0.711 — almost no separation</w:t>
+            </w:r>
+          </w:p>
+        </w:tc>
+      </w:tr>
+      <w:tr>
+        <w:tc>
+          <w:tcPr>
+            <w:tcW w:type="dxa" w:w="4514"/>
+          </w:tcPr>
+          <w:p>
+            <w:r>
+              <w:t>End-to-end latency</w:t>
+            </w:r>
+          </w:p>
+        </w:tc>
+        <w:tc>
+          <w:tcPr>
+            <w:tcW w:type="dxa" w:w="4514"/>
+          </w:tcPr>
+          <w:p>
+            <w:r>
+              <w:t>0.79 s local, 6.75 s on the live Space</w:t>
+            </w:r>
+          </w:p>
+        </w:tc>
+      </w:tr>
+    </w:tbl>
+    <w:p>
+      <w:r>
+        <w:t>Read it as strong evidence of a large domain gap and weak open-set separation rather than as a precise estimate: PlantDoc labels are themselves web-sourced, only 17 of the 51 classes are covered (none of the banana, citrus, cucumber, mango or rice classes most relevant to Nepal), and the 95% Wilson interval for 48.0% on 148 images is roughly 40–56%. Errors are largely agronomically plausible — tomato Septoria predicted as tomato early blight, tomato late blight as potato late blight — which is itself an argument for letting the user’s crop selection constrain the prediction.</w:t>
       </w:r>
     </w:p>
     <w:p>
@@ -10165,14 +10332,7 @@
           <w:color w:val="8E2F22"/>
           <w:sz w:val="17"/>
         </w:rPr>
-        <w:t xml:space="preserve">[Blocking]  </w:t>
-      </w:r>
-      <w:r>
-        <w:rPr>
-          <w:b/>
-          <w:sz w:val="21"/>
-        </w:rPr>
-        <w:t>Open-set rejection is off in the default deployment</w:t>
+        <w:t>[Resolved] Open-set rejection is live — but it does not separate well</w:t>
       </w:r>
     </w:p>
     <w:p>
@@ -10181,40 +10341,7 @@
         <w:ind w:left="144"/>
       </w:pPr>
       <w:r>
-        <w:t xml:space="preserve">The file is named </w:t>
-      </w:r>
-      <w:r>
-        <w:rPr>
-          <w:rFonts w:ascii="Consolas" w:hAnsi="Consolas"/>
-          <w:color w:val="33443A"/>
-          <w:sz w:val="19"/>
-        </w:rPr>
-        <w:t>odd_stats.npz</w:t>
-      </w:r>
-      <w:r>
-        <w:t xml:space="preserve"> where </w:t>
-      </w:r>
-      <w:r>
-        <w:rPr>
-          <w:rFonts w:ascii="Consolas" w:hAnsi="Consolas"/>
-          <w:color w:val="33443A"/>
-          <w:sz w:val="19"/>
-        </w:rPr>
-        <w:t>main.py</w:t>
-      </w:r>
-      <w:r>
-        <w:t xml:space="preserve"> looks for </w:t>
-      </w:r>
-      <w:r>
-        <w:rPr>
-          <w:rFonts w:ascii="Consolas" w:hAnsi="Consolas"/>
-          <w:color w:val="33443A"/>
-          <w:sz w:val="19"/>
-        </w:rPr>
-        <w:t>ood_stats.npz</w:t>
-      </w:r>
-      <w:r>
-        <w:t>, and its contents are four scalars instead of the 51×512 centroid array. Fix by re-exporting from section 15c of the same training run — do not copy the older file, because centroids are only meaningful against the weights they were computed from.</w:t>
+        <w:t>The mis-named statistics file that silently disabled this rule was regenerated from the deployed run: last_final_model/ood_stats.npz now holds 51 centroids × 512 dimensions with threshold 0.5596, and start-up logs confirm rejection is enabled. Measured on PlantDoc, however, the score distributions of supported and untrained crops overlap almost completely (means 0.701 vs 0.711), so the rule adds little separation. The mechanism works end to end; its discriminative power on field photographs is the open problem.</w:t>
       </w:r>
     </w:p>
     <w:p>
@@ -10232,14 +10359,7 @@
           <w:color w:val="8E2F22"/>
           <w:sz w:val="17"/>
         </w:rPr>
-        <w:t xml:space="preserve">[Blocking]  </w:t>
-      </w:r>
-      <w:r>
-        <w:rPr>
-          <w:b/>
-          <w:sz w:val="21"/>
-        </w:rPr>
-        <w:t>No saved metrics for the deployed model</w:t>
+        <w:t>[Substantive] No saved training metrics for the deployed checkpoint</w:t>
       </w:r>
     </w:p>
     <w:p>
@@ -10248,18 +10368,7 @@
         <w:ind w:left="144"/>
       </w:pPr>
       <w:r>
-        <w:t xml:space="preserve">Both notebooks have zero cell outputs. There is no macro-F1, no per-class report, and no field-only accuracy for </w:t>
-      </w:r>
-      <w:r>
-        <w:rPr>
-          <w:rFonts w:ascii="Consolas" w:hAnsi="Consolas"/>
-          <w:color w:val="33443A"/>
-          <w:sz w:val="19"/>
-        </w:rPr>
-        <w:t>last_final_model</w:t>
-      </w:r>
-      <w:r>
-        <w:t xml:space="preserve"> — only PNGs from an earlier 51-class run. This is the highest-value thing to fix before the defense.</w:t>
+        <w:t>Both notebooks have zero cell outputs, so there is no macro-F1 or per-class report from the run that produced last_final_model — the saved curves and confusion matrix come from the earlier 31 Aug 51-class run. The independent PlantDoc evaluation (13.6) supplies the field numbers, but the internal held-out metrics remain unsaved.</w:t>
       </w:r>
     </w:p>
     <w:p>
@@ -10277,14 +10386,7 @@
           <w:color w:val="7A550E"/>
           <w:sz w:val="17"/>
         </w:rPr>
-        <w:t xml:space="preserve">[Substantive]  </w:t>
-      </w:r>
-      <w:r>
-        <w:rPr>
-          <w:b/>
-          <w:sz w:val="21"/>
-        </w:rPr>
-        <w:t>Untrained-crop rejection was never measured</w:t>
+        <w:t>[Substantive] Untrained-crop rejection is measured — and weak</w:t>
       </w:r>
     </w:p>
     <w:p>
@@ -10298,10 +10400,7 @@
           <w:color w:val="33443A"/>
           <w:sz w:val="19"/>
         </w:rPr>
-        <w:t>HOLDOUT_UNTRAINED = None</w:t>
-      </w:r>
-      <w:r>
-        <w:t>, so the rejection test in sections 15b and 15c has never run against a real held-out untrained crop. The mechanism is designed and implemented; its effectiveness is currently unquantified.</w:t>
+        <w:t>On 74 PlantDoc leaves from crops the model has never seen, only 21 (28.4%) were declined. The remainder were shown as a supported class, most often a healthy one. This is the weakest measured result in the project and should be stated before the panel finds it.</w:t>
       </w:r>
     </w:p>
     <w:p>
@@ -10335,7 +10434,7 @@
         <w:ind w:left="144"/>
       </w:pPr>
       <w:r>
-        <w:t>1,592 images from Bing search, cleaned by automated dedup and human visual review, but with no agronomist sign-off. Because train and test slices come from the same scrape, residual label noise is correlated and would inflate the field score.</w:t>
+        <w:t>1,593 images from Bing search, cleaned by automated dedup and human visual review, but with no agronomist sign-off. Because the internal train and test slices come from the same scrape, residual label noise is correlated; the PlantDoc evaluation avoids this by using an independently collected benchmark with near-duplicates removed.</w:t>
       </w:r>
     </w:p>
     <w:p>
@@ -10680,7 +10779,94 @@
         <w:ind w:left="360"/>
       </w:pPr>
       <w:r>
-        <w:t xml:space="preserve">Not at that number, no — and the project is built around admitting it. That figure is a lab-set score on curated, plain-background images, and it is the well-documented inflated result that PlantVillage-style datasets produce. Three mechanisms exist specifically to narrow the gap: 1,592 real field photos merged into training, the </w:t>
+        <w:t>Not at that number, no — and the project is built around admitting it. That figure is a lab-set score on curated, plain-background images, and it is the well-documented inflated result that PlantVillage-style datasets produce. Measured through the deployed API on 226 independent PlantDoc field photographs, top-1 accuracy is 48.0% and top-5 is 81.8%, with the crop correct 70.9% of the time; predictions at 80% confidence or above are correct 81.8% of the time. Three mechanisms narrow the gap — 1,593 real field photos merged into training, the field_augment pipeline that adds blur, sensor noise and directional shadow to lab images, and crop_to_leaf at inference — but the gap remains the dominant limitation.</w:t>
+      </w:r>
+    </w:p>
+    <w:p>
+      <w:pPr>
+        <w:keepNext/>
+        <w:spacing w:before="200" w:after="40"/>
+      </w:pPr>
+      <w:r>
+        <w:rPr>
+          <w:b/>
+          <w:color w:val="1F5C38"/>
+        </w:rPr>
+        <w:t xml:space="preserve">Q.  </w:t>
+      </w:r>
+      <w:r>
+        <w:rPr>
+          <w:b/>
+          <w:sz w:val="21"/>
+        </w:rPr>
+        <w:t>What happens if I photograph my hand? Or a crop you never trained on?</w:t>
+      </w:r>
+    </w:p>
+    <w:p>
+      <w:pPr>
+        <w:spacing w:after="120"/>
+        <w:ind w:left="360"/>
+      </w:pPr>
+      <w:r>
+        <w:t>Three different defences, in order. A hand fails is_leaf_image — insufficient leaf-colour ratio, wrong edge profile — and returns “Not a Leaf” without running the model. An untrained crop passes that check because it genuinely is a leaf, so it hits the Unknown gate: a low-confidence, high-entropy or near-tie prediction is declined statistically, and the open-set rule measures cosine distance to the trained-class centroids for the case where the model is confidently wrong. Both are live in the deployed build. Measured honestly, the gate declined 28.4% of untrained-crop leaves on PlantDoc — the mechanism is right in principle, and its separation on field photographs is the weakest part of the system.</w:t>
+      </w:r>
+    </w:p>
+    <w:p>
+      <w:pPr>
+        <w:keepNext/>
+        <w:spacing w:before="200" w:after="40"/>
+      </w:pPr>
+      <w:r>
+        <w:rPr>
+          <w:b/>
+          <w:color w:val="1F5C38"/>
+        </w:rPr>
+        <w:t xml:space="preserve">Q.  </w:t>
+      </w:r>
+      <w:r>
+        <w:rPr>
+          <w:b/>
+          <w:sz w:val="21"/>
+        </w:rPr>
+        <w:t>Why can’t softmax confidence alone reject an unknown crop?</w:t>
+      </w:r>
+    </w:p>
+    <w:p>
+      <w:pPr>
+        <w:spacing w:after="120"/>
+        <w:ind w:left="360"/>
+      </w:pPr>
+      <w:r>
+        <w:t>Because softmax is closed-set — the outputs are constrained to sum to 1 across the trained classes. It answers “which of my 52 classes is relatively most likely”, never “does this belong to any of them”. A guava leaf shares the visual grammar of the trained leaves, so the network genuinely can be 88% confident it is Potato Early Blight. No confidence threshold reaches that case. Distance in feature space does, because it asks a different question: how far is this from anything I have seen. That is why the two rules are OR-ed rather than one replacing the other.</w:t>
+      </w:r>
+    </w:p>
+    <w:p>
+      <w:pPr>
+        <w:keepNext/>
+        <w:spacing w:before="200" w:after="40"/>
+      </w:pPr>
+      <w:r>
+        <w:rPr>
+          <w:b/>
+          <w:color w:val="1F5C38"/>
+        </w:rPr>
+        <w:t xml:space="preserve">Q.  </w:t>
+      </w:r>
+      <w:r>
+        <w:rPr>
+          <w:b/>
+          <w:sz w:val="21"/>
+        </w:rPr>
+        <w:t>Your dataset is severely imbalanced — 2,384 images in one class and 23 in another. How did you handle that?</w:t>
+      </w:r>
+    </w:p>
+    <w:p>
+      <w:pPr>
+        <w:spacing w:after="120"/>
+        <w:ind w:left="360"/>
+      </w:pPr>
+      <w:r>
+        <w:t xml:space="preserve">Four layers, applied gently so they do not compound. Undersample majorities to 2.0× the median and oversample minorities to 1.2× median, which caps the ratio at about 2:1. Protect real field photos and real non-target leaves from ever being the images deleted. Apply sqrt-damped class weights </w:t>
       </w:r>
       <w:r>
         <w:rPr>
@@ -10688,10 +10874,268 @@
           <w:color w:val="33443A"/>
           <w:sz w:val="19"/>
         </w:rPr>
-        <w:t>field_augment</w:t>
-      </w:r>
-      <w:r>
-        <w:t xml:space="preserve"> pipeline that adds blur, sensor noise and directional shadow to lab images, and </w:t>
+        <w:t>sqrt(mean/n)</w:t>
+      </w:r>
+      <w:r>
+        <w:t xml:space="preserve"> — the earlier </w:t>
+      </w:r>
+      <w:r>
+        <w:rPr>
+          <w:rFonts w:ascii="Consolas" w:hAnsi="Consolas"/>
+          <w:color w:val="33443A"/>
+          <w:sz w:val="19"/>
+        </w:rPr>
+        <w:t>max/n</w:t>
+      </w:r>
+      <w:r>
+        <w:t xml:space="preserve"> scheme gave weights of 1–6 which, stacked on top of resampling, double-corrected and destabilised training. And most importantly: checkpoint and report on </w:t>
+      </w:r>
+      <w:r>
+        <w:rPr>
+          <w:b/>
+        </w:rPr>
+        <w:t>macro-F1</w:t>
+      </w:r>
+      <w:r>
+        <w:t>, not accuracy, so the saved model cannot win by favouring the crops with the most images.</w:t>
+      </w:r>
+    </w:p>
+    <w:p>
+      <w:pPr>
+        <w:keepNext/>
+        <w:spacing w:before="200" w:after="40"/>
+      </w:pPr>
+      <w:r>
+        <w:rPr>
+          <w:b/>
+          <w:color w:val="1F5C38"/>
+        </w:rPr>
+        <w:t xml:space="preserve">Q.  </w:t>
+      </w:r>
+      <w:r>
+        <w:rPr>
+          <w:b/>
+          <w:sz w:val="21"/>
+        </w:rPr>
+        <w:t>Why two training phases instead of just fine-tuning everything?</w:t>
+      </w:r>
+    </w:p>
+    <w:p>
+      <w:pPr>
+        <w:spacing w:after="120"/>
+        <w:ind w:left="360"/>
+      </w:pPr>
+      <w:r>
+        <w:t>The classifier head starts with random weights. Unfreezing the pretrained backbone while random gradients flow back through it destroys the ImageNet features you paid for in the first place. Phase 1 freezes the backbone and trains only the head at 5e-4 until the head produces sensible gradients. Phase 2 then unfreezes — except the first 100 layers, which hold generic edge and texture filters worth keeping — and fine-tunes at 1e-4 on a cosine decay to 1e-6. Two orders of magnitude between the phase learning rates is the whole point.</w:t>
+      </w:r>
+    </w:p>
+    <w:p>
+      <w:pPr>
+        <w:keepNext/>
+        <w:spacing w:before="200" w:after="40"/>
+      </w:pPr>
+      <w:r>
+        <w:rPr>
+          <w:b/>
+          <w:color w:val="1F5C38"/>
+        </w:rPr>
+        <w:t xml:space="preserve">Q.  </w:t>
+      </w:r>
+      <w:r>
+        <w:rPr>
+          <w:b/>
+          <w:sz w:val="21"/>
+        </w:rPr>
+        <w:t>What does the Grad-CAM heatmap actually prove?</w:t>
+      </w:r>
+    </w:p>
+    <w:p>
+      <w:pPr>
+        <w:spacing w:after="120"/>
+        <w:ind w:left="360"/>
+      </w:pPr>
+      <w:r>
+        <w:t>That the prediction was driven by the lesion rather than by the background — and nothing more than that. It is an attribution method: it shows where gradient signal for the chosen class concentrated in the last convolutional feature map. It does not verify that the class is correct; a confidently wrong model produces a plausible heatmap over a real lesion it has misidentified. The UI says this in as many words. Its practical value is catching the obvious failure: if the heat sits on a background twig or the photographer’s thumb, the user knows to retake the photo without needing to understand the model.</w:t>
+      </w:r>
+    </w:p>
+    <w:p>
+      <w:pPr>
+        <w:keepNext/>
+        <w:spacing w:before="200" w:after="40"/>
+      </w:pPr>
+      <w:r>
+        <w:rPr>
+          <w:b/>
+          <w:color w:val="1F5C38"/>
+        </w:rPr>
+        <w:t xml:space="preserve">Q.  </w:t>
+      </w:r>
+      <w:r>
+        <w:rPr>
+          <w:b/>
+          <w:sz w:val="21"/>
+        </w:rPr>
+        <w:t>Why is there no login requirement?</w:t>
+      </w:r>
+    </w:p>
+    <w:p>
+      <w:pPr>
+        <w:spacing w:after="120"/>
+        <w:ind w:left="360"/>
+      </w:pPr>
+      <w:r>
+        <w:t xml:space="preserve">Because requiring an account to diagnose a leaf would be a product failure for the intended user. The diagnosis is the value, and it has no dependency on identity — so </w:t>
+      </w:r>
+      <w:r>
+        <w:rPr>
+          <w:rFonts w:ascii="Consolas" w:hAnsi="Consolas"/>
+          <w:color w:val="33443A"/>
+          <w:sz w:val="19"/>
+        </w:rPr>
+        <w:t>/predict</w:t>
+      </w:r>
+      <w:r>
+        <w:t xml:space="preserve"> takes no auth and touches no database, </w:t>
+      </w:r>
+      <w:r>
+        <w:rPr>
+          <w:rFonts w:ascii="Consolas" w:hAnsi="Consolas"/>
+          <w:color w:val="33443A"/>
+          <w:sz w:val="19"/>
+        </w:rPr>
+        <w:t>init_db()</w:t>
+      </w:r>
+      <w:r>
+        <w:t xml:space="preserve"> failure is caught and logged rather than fatal, and history lives in browser </w:t>
+      </w:r>
+      <w:r>
+        <w:rPr>
+          <w:rFonts w:ascii="Consolas" w:hAnsi="Consolas"/>
+          <w:color w:val="33443A"/>
+          <w:sz w:val="19"/>
+        </w:rPr>
+        <w:t>localStorage</w:t>
+      </w:r>
+      <w:r>
+        <w:t>. The whole system runs on a single container with no persistence layer. JWT auth, bcrypt and the Postgres schema are all implemented and working; accounts are genuinely additive rather than a gate.</w:t>
+      </w:r>
+    </w:p>
+    <w:p>
+      <w:pPr>
+        <w:keepNext/>
+        <w:spacing w:before="200" w:after="40"/>
+      </w:pPr>
+      <w:r>
+        <w:rPr>
+          <w:b/>
+          <w:color w:val="1F5C38"/>
+        </w:rPr>
+        <w:t xml:space="preserve">Q.  </w:t>
+      </w:r>
+      <w:r>
+        <w:rPr>
+          <w:b/>
+          <w:sz w:val="21"/>
+        </w:rPr>
+        <w:t>Where did the field images come from, and how do you know the labels are right?</w:t>
+      </w:r>
+    </w:p>
+    <w:p>
+      <w:pPr>
+        <w:spacing w:after="120"/>
+        <w:ind w:left="360"/>
+      </w:pPr>
+      <w:r>
+        <w:t xml:space="preserve">Bing image search via </w:t>
+      </w:r>
+      <w:r>
+        <w:rPr>
+          <w:rFonts w:ascii="Consolas" w:hAnsi="Consolas"/>
+          <w:color w:val="33443A"/>
+          <w:sz w:val="19"/>
+        </w:rPr>
+        <w:t>icrawler</w:t>
+      </w:r>
+      <w:r>
+        <w:t xml:space="preserve">, with a hand-written query per class, then a five-stage cleaning pipeline: remove corrupt and sub-224 px files, remove near-duplicates within a folder by 8×8 average hash at Hamming distance ≤ 4, delete </w:t>
+      </w:r>
+      <w:r>
+        <w:rPr>
+          <w:i/>
+        </w:rPr>
+        <w:t>every</w:t>
+      </w:r>
+      <w:r>
+        <w:t xml:space="preserve"> copy of any image appearing in two class folders (at least one label is wrong and a wrong label on a confusable pair costs more than a missing image), review each class as a numbered contact sheet and delete by tile index, then re-download thin classes using Latin pathogen names to avoid lookalikes. I want to be direct: this is not expert-verified data. Residual label noise exists, and because train and test come from the same scrape, that noise is correlated — which would inflate the field score. An agronomist review pass is the correct next step.</w:t>
+      </w:r>
+    </w:p>
+    <w:p>
+      <w:pPr>
+        <w:keepNext/>
+        <w:spacing w:before="200" w:after="40"/>
+      </w:pPr>
+      <w:r>
+        <w:rPr>
+          <w:b/>
+          <w:color w:val="1F5C38"/>
+        </w:rPr>
+        <w:t xml:space="preserve">Q.  </w:t>
+      </w:r>
+      <w:r>
+        <w:rPr>
+          <w:b/>
+          <w:sz w:val="21"/>
+        </w:rPr>
+        <w:t>Why does the model reject some real leaves as unknown?</w:t>
+      </w:r>
+    </w:p>
+    <w:p>
+      <w:pPr>
+        <w:spacing w:after="120"/>
+        <w:ind w:left="360"/>
+      </w:pPr>
+      <w:r>
+        <w:t xml:space="preserve">Because that is the calibrated price of rejection, and it is a number rather than an accident. The open-set threshold is set at the 5th percentile of known-class validation scores, so </w:t>
+      </w:r>
+      <w:r>
+        <w:rPr>
+          <w:rFonts w:ascii="Consolas" w:hAnsi="Consolas"/>
+          <w:color w:val="33443A"/>
+          <w:sz w:val="19"/>
+        </w:rPr>
+        <w:t>TARGET_KNOWN_ACCEPT = 0.95</w:t>
+      </w:r>
+      <w:r>
+        <w:t xml:space="preserve"> — up to 5% of genuine known-crop leaves are expected to be wrongly rejected. Raising the threshold catches more unknowns and rejects more real leaves; lowering it does the reverse. For an advisory agricultural tool, “I’m not sure, take another photo” is a far cheaper error than confidently naming the wrong disease and sending someone to buy the wrong pesticide.</w:t>
+      </w:r>
+    </w:p>
+    <w:p>
+      <w:pPr>
+        <w:keepNext/>
+        <w:spacing w:before="200" w:after="40"/>
+      </w:pPr>
+      <w:r>
+        <w:rPr>
+          <w:b/>
+          <w:color w:val="1F5C38"/>
+        </w:rPr>
+        <w:t xml:space="preserve">Q.  </w:t>
+      </w:r>
+      <w:r>
+        <w:rPr>
+          <w:b/>
+          <w:sz w:val="21"/>
+        </w:rPr>
+        <w:t>Why crop the leaf before classifying? Doesn’t that risk destroying information?</w:t>
+      </w:r>
+    </w:p>
+    <w:p>
+      <w:pPr>
+        <w:spacing w:after="120"/>
+        <w:ind w:left="360"/>
+      </w:pPr>
+      <w:r>
+        <w:t xml:space="preserve">It would, which is why every failure path returns the original image untouched. The model is trained mostly on centred lab leaves, so a field photo of soil, sky and neighbouring plants is out of distribution before the classifier sees it. </w:t>
       </w:r>
       <w:r>
         <w:rPr>
@@ -10702,18 +11146,7 @@
         <w:t>crop_to_leaf</w:t>
       </w:r>
       <w:r>
-        <w:t xml:space="preserve"> at inference which isolates the leaf from a cluttered scene before classification. The notebook maintains a separate </w:t>
-      </w:r>
-      <w:r>
-        <w:rPr>
-          <w:rFonts w:ascii="Consolas" w:hAnsi="Consolas"/>
-          <w:color w:val="33443A"/>
-          <w:sz w:val="19"/>
-        </w:rPr>
-        <w:t>field_test</w:t>
-      </w:r>
-      <w:r>
-        <w:t xml:space="preserve"> split to measure the residual gap — and that measurement is the number I would want to report, which is exactly the number currently missing.</w:t>
+        <w:t xml:space="preserve"> builds a mask from Excess-Green plus a deliberately narrow diseased-tissue hue band — narrow so brown soil, which shares that hue, is not swept in — and crops to the largest blob. Then the rails: if the blob is under 5% of the frame the mask is untrustworthy, over 90% means it is already a lab photo, and a crop thinner than 15% of either dimension is rejected. Any of those, or any exception, and the original goes through unchanged. It can only help.</w:t>
       </w:r>
     </w:p>
     <w:p>
@@ -10733,7 +11166,7 @@
           <w:b/>
           <w:sz w:val="21"/>
         </w:rPr>
-        <w:t>What happens if I photograph my hand? Or a crop you never trained on?</w:t>
+        <w:t>Why is everything bilingual?</w:t>
       </w:r>
     </w:p>
     <w:p>
@@ -10742,7 +11175,7 @@
         <w:ind w:left="360"/>
       </w:pPr>
       <w:r>
-        <w:t xml:space="preserve">Three different defences, in order. A hand fails </w:t>
+        <w:t>Because the intended user is a Nepali farmer, and an English-only agricultural tool is not usable by the people it is for. It is not a translation layer bolted on top — every content field in the knowledge base is stored as a matched pair (</w:t>
       </w:r>
       <w:r>
         <w:rPr>
@@ -10750,19 +11183,21 @@
           <w:color w:val="33443A"/>
           <w:sz w:val="19"/>
         </w:rPr>
-        <w:t>is_leaf_image</w:t>
-      </w:r>
-      <w:r>
-        <w:t xml:space="preserve"> — insufficient leaf-colour ratio, wrong edge profile — and returns “Not a Leaf” without running the model. An untrained crop passes that check because it genuinely is a leaf, so it hits the Unknown gate: a low-confidence, high-entropy, or near-tie prediction is declined statistically, and the open-set rule catches the harder case where the model is </w:t>
+        <w:t>symptoms</w:t>
+      </w:r>
+      <w:r>
+        <w:t xml:space="preserve"> / </w:t>
       </w:r>
       <w:r>
         <w:rPr>
-          <w:i/>
+          <w:rFonts w:ascii="Consolas" w:hAnsi="Consolas"/>
+          <w:color w:val="33443A"/>
+          <w:sz w:val="19"/>
         </w:rPr>
-        <w:t>confidently</w:t>
-      </w:r>
-      <w:r>
-        <w:t xml:space="preserve"> wrong by measuring cosine distance to the trained-class centroids in feature space. And the training set contains a real Unknown class of non-target leaves, so the model can name that outcome directly. I should note that the open-set component is currently disabled by a filename mismatch in the deployed checkpoint — conditions 1 through 4 are active.</w:t>
+        <w:t>symptoms_np</w:t>
+      </w:r>
+      <w:r>
+        <w:t>), the API returns both in every response, and the clients pick per the language toggle. That means switching language re-renders an existing result with no new network call, and it means the safety disclaimer — the pesticide-label warning — is never the part that fails to translate.</w:t>
       </w:r>
     </w:p>
     <w:p>
@@ -10782,7 +11217,7 @@
           <w:b/>
           <w:sz w:val="21"/>
         </w:rPr>
-        <w:t>Why can’t softmax confidence alone reject an unknown crop?</w:t>
+        <w:t>What would you do next, with more time?</w:t>
       </w:r>
     </w:p>
     <w:p>
@@ -10791,427 +11226,7 @@
         <w:ind w:left="360"/>
       </w:pPr>
       <w:r>
-        <w:t>Because softmax is closed-set — the outputs are constrained to sum to 1 across the trained classes. It answers “which of my 52 classes is relatively most likely”, never “does this belong to any of them”. A guava leaf shares the visual grammar of the trained leaves, so the network genuinely can be 88% confident it is Potato Early Blight. No confidence threshold reaches that case. Distance in feature space does, because it asks a different question: how far is this from anything I have seen. That is why the two rules are OR-ed rather than one replacing the other.</w:t>
-      </w:r>
-    </w:p>
-    <w:p>
-      <w:pPr>
-        <w:keepNext/>
-        <w:spacing w:before="200" w:after="40"/>
-      </w:pPr>
-      <w:r>
-        <w:rPr>
-          <w:b/>
-          <w:color w:val="1F5C38"/>
-        </w:rPr>
-        <w:t xml:space="preserve">Q.  </w:t>
-      </w:r>
-      <w:r>
-        <w:rPr>
-          <w:b/>
-          <w:sz w:val="21"/>
-        </w:rPr>
-        <w:t>Your dataset is severely imbalanced — 2,384 images in one class and 23 in another. How did you handle that?</w:t>
-      </w:r>
-    </w:p>
-    <w:p>
-      <w:pPr>
-        <w:spacing w:after="120"/>
-        <w:ind w:left="360"/>
-      </w:pPr>
-      <w:r>
-        <w:t xml:space="preserve">Four layers, applied gently so they do not compound. Undersample majorities to 2.0× the median and oversample minorities to 1.2× median, which caps the ratio at about 2:1. Protect real field photos and real non-target leaves from ever being the images deleted. Apply sqrt-damped class weights </w:t>
-      </w:r>
-      <w:r>
-        <w:rPr>
-          <w:rFonts w:ascii="Consolas" w:hAnsi="Consolas"/>
-          <w:color w:val="33443A"/>
-          <w:sz w:val="19"/>
-        </w:rPr>
-        <w:t>sqrt(mean/n)</w:t>
-      </w:r>
-      <w:r>
-        <w:t xml:space="preserve"> — the earlier </w:t>
-      </w:r>
-      <w:r>
-        <w:rPr>
-          <w:rFonts w:ascii="Consolas" w:hAnsi="Consolas"/>
-          <w:color w:val="33443A"/>
-          <w:sz w:val="19"/>
-        </w:rPr>
-        <w:t>max/n</w:t>
-      </w:r>
-      <w:r>
-        <w:t xml:space="preserve"> scheme gave weights of 1–6 which, stacked on top of resampling, double-corrected and destabilised training. And most importantly: checkpoint and report on </w:t>
-      </w:r>
-      <w:r>
-        <w:rPr>
-          <w:b/>
-        </w:rPr>
-        <w:t>macro-F1</w:t>
-      </w:r>
-      <w:r>
-        <w:t>, not accuracy, so the saved model cannot win by favouring the crops with the most images.</w:t>
-      </w:r>
-    </w:p>
-    <w:p>
-      <w:pPr>
-        <w:keepNext/>
-        <w:spacing w:before="200" w:after="40"/>
-      </w:pPr>
-      <w:r>
-        <w:rPr>
-          <w:b/>
-          <w:color w:val="1F5C38"/>
-        </w:rPr>
-        <w:t xml:space="preserve">Q.  </w:t>
-      </w:r>
-      <w:r>
-        <w:rPr>
-          <w:b/>
-          <w:sz w:val="21"/>
-        </w:rPr>
-        <w:t>Why two training phases instead of just fine-tuning everything?</w:t>
-      </w:r>
-    </w:p>
-    <w:p>
-      <w:pPr>
-        <w:spacing w:after="120"/>
-        <w:ind w:left="360"/>
-      </w:pPr>
-      <w:r>
-        <w:t>The classifier head starts with random weights. Unfreezing the pretrained backbone while random gradients flow back through it destroys the ImageNet features you paid for in the first place. Phase 1 freezes the backbone and trains only the head at 5e-4 until the head produces sensible gradients. Phase 2 then unfreezes — except the first 100 layers, which hold generic edge and texture filters worth keeping — and fine-tunes at 1e-4 on a cosine decay to 1e-6. Two orders of magnitude between the phase learning rates is the whole point.</w:t>
-      </w:r>
-    </w:p>
-    <w:p>
-      <w:pPr>
-        <w:keepNext/>
-        <w:spacing w:before="200" w:after="40"/>
-      </w:pPr>
-      <w:r>
-        <w:rPr>
-          <w:b/>
-          <w:color w:val="1F5C38"/>
-        </w:rPr>
-        <w:t xml:space="preserve">Q.  </w:t>
-      </w:r>
-      <w:r>
-        <w:rPr>
-          <w:b/>
-          <w:sz w:val="21"/>
-        </w:rPr>
-        <w:t>What does the Grad-CAM heatmap actually prove?</w:t>
-      </w:r>
-    </w:p>
-    <w:p>
-      <w:pPr>
-        <w:spacing w:after="120"/>
-        <w:ind w:left="360"/>
-      </w:pPr>
-      <w:r>
-        <w:t>That the prediction was driven by the lesion rather than by the background — and nothing more than that. It is an attribution method: it shows where gradient signal for the chosen class concentrated in the last convolutional feature map. It does not verify that the class is correct; a confidently wrong model produces a plausible heatmap over a real lesion it has misidentified. The UI says this in as many words. Its practical value is catching the obvious failure: if the heat sits on a background twig or the photographer’s thumb, the user knows to retake the photo without needing to understand the model.</w:t>
-      </w:r>
-    </w:p>
-    <w:p>
-      <w:pPr>
-        <w:keepNext/>
-        <w:spacing w:before="200" w:after="40"/>
-      </w:pPr>
-      <w:r>
-        <w:rPr>
-          <w:b/>
-          <w:color w:val="1F5C38"/>
-        </w:rPr>
-        <w:t xml:space="preserve">Q.  </w:t>
-      </w:r>
-      <w:r>
-        <w:rPr>
-          <w:b/>
-          <w:sz w:val="21"/>
-        </w:rPr>
-        <w:t>Why is there no login requirement?</w:t>
-      </w:r>
-    </w:p>
-    <w:p>
-      <w:pPr>
-        <w:spacing w:after="120"/>
-        <w:ind w:left="360"/>
-      </w:pPr>
-      <w:r>
-        <w:t xml:space="preserve">Because requiring an account to diagnose a leaf would be a product failure for the intended user. The diagnosis is the value, and it has no dependency on identity — so </w:t>
-      </w:r>
-      <w:r>
-        <w:rPr>
-          <w:rFonts w:ascii="Consolas" w:hAnsi="Consolas"/>
-          <w:color w:val="33443A"/>
-          <w:sz w:val="19"/>
-        </w:rPr>
-        <w:t>/predict</w:t>
-      </w:r>
-      <w:r>
-        <w:t xml:space="preserve"> takes no auth and touches no database, </w:t>
-      </w:r>
-      <w:r>
-        <w:rPr>
-          <w:rFonts w:ascii="Consolas" w:hAnsi="Consolas"/>
-          <w:color w:val="33443A"/>
-          <w:sz w:val="19"/>
-        </w:rPr>
-        <w:t>init_db()</w:t>
-      </w:r>
-      <w:r>
-        <w:t xml:space="preserve"> failure is caught and logged rather than fatal, and history lives in browser </w:t>
-      </w:r>
-      <w:r>
-        <w:rPr>
-          <w:rFonts w:ascii="Consolas" w:hAnsi="Consolas"/>
-          <w:color w:val="33443A"/>
-          <w:sz w:val="19"/>
-        </w:rPr>
-        <w:t>localStorage</w:t>
-      </w:r>
-      <w:r>
-        <w:t>. The whole system runs on a single container with no persistence layer. JWT auth, bcrypt and the Postgres schema are all implemented and working; accounts are genuinely additive rather than a gate.</w:t>
-      </w:r>
-    </w:p>
-    <w:p>
-      <w:pPr>
-        <w:keepNext/>
-        <w:spacing w:before="200" w:after="40"/>
-      </w:pPr>
-      <w:r>
-        <w:rPr>
-          <w:b/>
-          <w:color w:val="1F5C38"/>
-        </w:rPr>
-        <w:t xml:space="preserve">Q.  </w:t>
-      </w:r>
-      <w:r>
-        <w:rPr>
-          <w:b/>
-          <w:sz w:val="21"/>
-        </w:rPr>
-        <w:t>Where did the field images come from, and how do you know the labels are right?</w:t>
-      </w:r>
-    </w:p>
-    <w:p>
-      <w:pPr>
-        <w:spacing w:after="120"/>
-        <w:ind w:left="360"/>
-      </w:pPr>
-      <w:r>
-        <w:t xml:space="preserve">Bing image search via </w:t>
-      </w:r>
-      <w:r>
-        <w:rPr>
-          <w:rFonts w:ascii="Consolas" w:hAnsi="Consolas"/>
-          <w:color w:val="33443A"/>
-          <w:sz w:val="19"/>
-        </w:rPr>
-        <w:t>icrawler</w:t>
-      </w:r>
-      <w:r>
-        <w:t xml:space="preserve">, with a hand-written query per class, then a five-stage cleaning pipeline: remove corrupt and sub-224 px files, remove near-duplicates within a folder by 8×8 average hash at Hamming distance ≤ 4, delete </w:t>
-      </w:r>
-      <w:r>
-        <w:rPr>
-          <w:i/>
-        </w:rPr>
-        <w:t>every</w:t>
-      </w:r>
-      <w:r>
-        <w:t xml:space="preserve"> copy of any image appearing in two class folders (at least one label is wrong and a wrong label on a confusable pair costs more than a missing image), review each class as a numbered contact sheet and delete by tile index, then re-download thin classes using Latin pathogen names to avoid lookalikes. I want to be direct: this is not expert-verified data. Residual label noise exists, and because train and test come from the same scrape, that noise is correlated — which would inflate the field score. An agronomist review pass is the correct next step.</w:t>
-      </w:r>
-    </w:p>
-    <w:p>
-      <w:pPr>
-        <w:keepNext/>
-        <w:spacing w:before="200" w:after="40"/>
-      </w:pPr>
-      <w:r>
-        <w:rPr>
-          <w:b/>
-          <w:color w:val="1F5C38"/>
-        </w:rPr>
-        <w:t xml:space="preserve">Q.  </w:t>
-      </w:r>
-      <w:r>
-        <w:rPr>
-          <w:b/>
-          <w:sz w:val="21"/>
-        </w:rPr>
-        <w:t>Why does the model reject some real leaves as unknown?</w:t>
-      </w:r>
-    </w:p>
-    <w:p>
-      <w:pPr>
-        <w:spacing w:after="120"/>
-        <w:ind w:left="360"/>
-      </w:pPr>
-      <w:r>
-        <w:t xml:space="preserve">Because that is the calibrated price of rejection, and it is a number rather than an accident. The open-set threshold is set at the 5th percentile of known-class validation scores, so </w:t>
-      </w:r>
-      <w:r>
-        <w:rPr>
-          <w:rFonts w:ascii="Consolas" w:hAnsi="Consolas"/>
-          <w:color w:val="33443A"/>
-          <w:sz w:val="19"/>
-        </w:rPr>
-        <w:t>TARGET_KNOWN_ACCEPT = 0.95</w:t>
-      </w:r>
-      <w:r>
-        <w:t xml:space="preserve"> — up to 5% of genuine known-crop leaves are expected to be wrongly rejected. Raising the threshold catches more unknowns and rejects more real leaves; lowering it does the reverse. For an advisory agricultural tool, “I’m not sure, take another photo” is a far cheaper error than confidently naming the wrong disease and sending someone to buy the wrong pesticide.</w:t>
-      </w:r>
-    </w:p>
-    <w:p>
-      <w:pPr>
-        <w:keepNext/>
-        <w:spacing w:before="200" w:after="40"/>
-      </w:pPr>
-      <w:r>
-        <w:rPr>
-          <w:b/>
-          <w:color w:val="1F5C38"/>
-        </w:rPr>
-        <w:t xml:space="preserve">Q.  </w:t>
-      </w:r>
-      <w:r>
-        <w:rPr>
-          <w:b/>
-          <w:sz w:val="21"/>
-        </w:rPr>
-        <w:t>Why crop the leaf before classifying? Doesn’t that risk destroying information?</w:t>
-      </w:r>
-    </w:p>
-    <w:p>
-      <w:pPr>
-        <w:spacing w:after="120"/>
-        <w:ind w:left="360"/>
-      </w:pPr>
-      <w:r>
-        <w:t xml:space="preserve">It would, which is why every failure path returns the original image untouched. The model is trained mostly on centred lab leaves, so a field photo of soil, sky and neighbouring plants is out of distribution before the classifier sees it. </w:t>
-      </w:r>
-      <w:r>
-        <w:rPr>
-          <w:rFonts w:ascii="Consolas" w:hAnsi="Consolas"/>
-          <w:color w:val="33443A"/>
-          <w:sz w:val="19"/>
-        </w:rPr>
-        <w:t>crop_to_leaf</w:t>
-      </w:r>
-      <w:r>
-        <w:t xml:space="preserve"> builds a mask from Excess-Green plus a deliberately narrow diseased-tissue hue band — narrow so brown soil, which shares that hue, is not swept in — and crops to the largest blob. Then the rails: if the blob is under 5% of the frame the mask is untrustworthy, over 90% means it is already a lab photo, and a crop thinner than 15% of either dimension is rejected. Any of those, or any exception, and the original goes through unchanged. It can only help.</w:t>
-      </w:r>
-    </w:p>
-    <w:p>
-      <w:pPr>
-        <w:keepNext/>
-        <w:spacing w:before="200" w:after="40"/>
-      </w:pPr>
-      <w:r>
-        <w:rPr>
-          <w:b/>
-          <w:color w:val="1F5C38"/>
-        </w:rPr>
-        <w:t xml:space="preserve">Q.  </w:t>
-      </w:r>
-      <w:r>
-        <w:rPr>
-          <w:b/>
-          <w:sz w:val="21"/>
-        </w:rPr>
-        <w:t>Why is everything bilingual?</w:t>
-      </w:r>
-    </w:p>
-    <w:p>
-      <w:pPr>
-        <w:spacing w:after="120"/>
-        <w:ind w:left="360"/>
-      </w:pPr>
-      <w:r>
-        <w:t>Because the intended user is a Nepali farmer, and an English-only agricultural tool is not usable by the people it is for. It is not a translation layer bolted on top — every content field in the knowledge base is stored as a matched pair (</w:t>
-      </w:r>
-      <w:r>
-        <w:rPr>
-          <w:rFonts w:ascii="Consolas" w:hAnsi="Consolas"/>
-          <w:color w:val="33443A"/>
-          <w:sz w:val="19"/>
-        </w:rPr>
-        <w:t>symptoms</w:t>
-      </w:r>
-      <w:r>
-        <w:t xml:space="preserve"> / </w:t>
-      </w:r>
-      <w:r>
-        <w:rPr>
-          <w:rFonts w:ascii="Consolas" w:hAnsi="Consolas"/>
-          <w:color w:val="33443A"/>
-          <w:sz w:val="19"/>
-        </w:rPr>
-        <w:t>symptoms_np</w:t>
-      </w:r>
-      <w:r>
-        <w:t>), the API returns both in every response, and the clients pick per the language toggle. That means switching language re-renders an existing result with no new network call, and it means the safety disclaimer — the pesticide-label warning — is never the part that fails to translate.</w:t>
-      </w:r>
-    </w:p>
-    <w:p>
-      <w:pPr>
-        <w:keepNext/>
-        <w:spacing w:before="200" w:after="40"/>
-      </w:pPr>
-      <w:r>
-        <w:rPr>
-          <w:b/>
-          <w:color w:val="1F5C38"/>
-        </w:rPr>
-        <w:t xml:space="preserve">Q.  </w:t>
-      </w:r>
-      <w:r>
-        <w:rPr>
-          <w:b/>
-          <w:sz w:val="21"/>
-        </w:rPr>
-        <w:t>What would you do next, with more time?</w:t>
-      </w:r>
-    </w:p>
-    <w:p>
-      <w:pPr>
-        <w:spacing w:after="120"/>
-        <w:ind w:left="360"/>
-      </w:pPr>
-      <w:r>
-        <w:t xml:space="preserve">In order of value. First, re-run training with outputs saved and set </w:t>
-      </w:r>
-      <w:r>
-        <w:rPr>
-          <w:rFonts w:ascii="Consolas" w:hAnsi="Consolas"/>
-          <w:color w:val="33443A"/>
-          <w:sz w:val="19"/>
-        </w:rPr>
-        <w:t>HOLDOUT_UNTRAINED</w:t>
-      </w:r>
-      <w:r>
-        <w:t xml:space="preserve">, so per-class F1, the field-only score and the rejection rate all exist as measured numbers — the machinery is written, it just has not been run to completion with results preserved. Second, get an agronomist to verify the field labels. Third, replace the heuristic </w:t>
-      </w:r>
-      <w:r>
-        <w:rPr>
-          <w:rFonts w:ascii="Consolas" w:hAnsi="Consolas"/>
-          <w:color w:val="33443A"/>
-          <w:sz w:val="19"/>
-        </w:rPr>
-        <w:t>crop_to_leaf</w:t>
-      </w:r>
-      <w:r>
-        <w:t xml:space="preserve"> with a proper segmentation model, which would generalise far better than hand-tuned HSV thresholds. Fourth, add disease </w:t>
-      </w:r>
-      <w:r>
-        <w:rPr>
-          <w:i/>
-        </w:rPr>
-        <w:t>severity</w:t>
-      </w:r>
-      <w:r>
-        <w:t xml:space="preserve"> — a farmer needs to know how bad it is, not only what it is. Fifth, offline on-device inference via TFLite, because rural connectivity is exactly the constraint this tool runs into.</w:t>
+        <w:t>In order of value. First, expert-verified Nepali field data — the single change most likely to move the 48% field accuracy. Second, use the crop the user selects to constrain the prediction rather than only warn on mismatch; several of the commonest errors are cross-crop (tomato late blight predicted as potato late blight). Third, better open-set rejection: energy or Mahalanobis scores, calibrated on field rather than in-domain images. Fourth, re-run training with outputs preserved so internal per-class metrics exist. Fifth, on-device TensorFlow Lite inference, so the tool works where there is no signal.</w:t>
       </w:r>
     </w:p>
     <w:p>
@@ -11882,7 +11897,7 @@
           <w:color w:val="555F58"/>
           <w:sz w:val="17"/>
         </w:rPr>
-        <w:t>Compiled from the CropSense repository at commit e70df98 (branch main). Every figure, threshold, hyperparameter and file path in this document was read from the source rather than reconstructed from the README — where the README and the code disagree, the code is reported. Frontend test results were verified by running the suite.</w:t>
+        <w:t>Compiled from the CropSense repository at commit 79c0e33 (branch main), 16 September 2026. Every figure, threshold, hyperparameter and file path in this document was read from the source rather than reconstructed from the README — where the README and the code disagree, the code is reported. Frontend tests, the live API and the Android build were verified by running them.</w:t>
       </w:r>
     </w:p>
     <w:sectPr>

</xml_diff>

<commit_message>
Defense report: accounts required, hosted database, 28 tests
Co-Authored-By: Claude Opus 5 (1M context) <noreply@anthropic.com>
Claude-Session: https://claude.ai/code/session_01UKRbXq1FH3t1w2pD5c8Jk2
</commit_message>
<xml_diff>
--- a/CropSense_Defense_Report.docx
+++ b/CropSense_Defense_Report.docx
@@ -1222,54 +1222,12 @@
         <w:pStyle w:val="Heading2"/>
       </w:pPr>
       <w:r>
-        <w:t>2.1  Why the database is optional</w:t>
+        <w:t>2.1  Why the database is not on the critical path</w:t>
       </w:r>
     </w:p>
     <w:p>
       <w:r>
-        <w:t xml:space="preserve">This is the single most defensible architecture decision in the project. The core value of the system — diagnose a leaf — has no dependency on user identity. So </w:t>
-      </w:r>
-      <w:r>
-        <w:rPr>
-          <w:rFonts w:ascii="Consolas" w:hAnsi="Consolas"/>
-          <w:color w:val="33443A"/>
-          <w:sz w:val="19"/>
-        </w:rPr>
-        <w:t>/predict</w:t>
-      </w:r>
-      <w:r>
-        <w:t xml:space="preserve"> takes no auth, touches no database, and the startup path wraps </w:t>
-      </w:r>
-      <w:r>
-        <w:rPr>
-          <w:rFonts w:ascii="Consolas" w:hAnsi="Consolas"/>
-          <w:color w:val="33443A"/>
-          <w:sz w:val="19"/>
-        </w:rPr>
-        <w:t>init_db()</w:t>
-      </w:r>
-      <w:r>
-        <w:t xml:space="preserve"> in a try/except that logs a warning and continues. Prediction history is instead stored </w:t>
-      </w:r>
-      <w:r>
-        <w:rPr>
-          <w:b/>
-        </w:rPr>
-        <w:t>client-side</w:t>
-      </w:r>
-      <w:r>
-        <w:t xml:space="preserve"> in </w:t>
-      </w:r>
-      <w:r>
-        <w:rPr>
-          <w:rFonts w:ascii="Consolas" w:hAnsi="Consolas"/>
-          <w:color w:val="33443A"/>
-          <w:sz w:val="19"/>
-        </w:rPr>
-        <w:t>localStorage</w:t>
-      </w:r>
-      <w:r>
-        <w:t>. The result is that the whole app is usable with a single container and no persistence layer at all, and accounts are a genuinely additive feature rather than a gate.</w:t>
+        <w:t>Accounts are required by both clients, but the inference path deliberately is not coupled to them. /predict takes an OPTIONAL bearer token (HTTPBearer(auto_error=False)): with one the result is written to that user’s history, without one the diagnosis is still produced and simply not stored. Saving is wrapped in try/except, and init_db() failure at startup is caught and logged. The consequence is that a database outage, an expired token or a slow cold start can degrade the product to “no history”, never to “no diagnosis” — which is the property worth defending. The sign-in requirement itself lives in the clients.</w:t>
       </w:r>
     </w:p>
     <w:p>
@@ -7218,7 +7176,7 @@
               <w:rPr>
                 <w:sz w:val="18"/>
               </w:rPr>
-              <w:t>Local-first list with crop/status/sort/search filters, plus detail view</w:t>
+              <w:t>Account history with crop/status/sort/search, mirrored locally, plus detail view</w:t>
             </w:r>
           </w:p>
         </w:tc>
@@ -7320,7 +7278,7 @@
               <w:rPr>
                 <w:sz w:val="18"/>
               </w:rPr>
-              <w:t>Optional; only /profile is gated by RequireAuth</w:t>
+              <w:t>Sign-in required; every route except /login and /register sits behind RequireAuth</w:t>
             </w:r>
           </w:p>
         </w:tc>
@@ -7920,43 +7878,12 @@
         <w:pStyle w:val="Heading2"/>
       </w:pPr>
       <w:r>
-        <w:t>11.1  Local-first history</w:t>
+        <w:t>11.1  Where a check is stored</w:t>
       </w:r>
     </w:p>
     <w:p>
       <w:r>
-        <w:t xml:space="preserve">Every check is written to </w:t>
-      </w:r>
-      <w:r>
-        <w:rPr>
-          <w:rFonts w:ascii="Consolas" w:hAnsi="Consolas"/>
-          <w:color w:val="33443A"/>
-          <w:sz w:val="19"/>
-        </w:rPr>
-        <w:t>localStorage</w:t>
-      </w:r>
-      <w:r>
-        <w:t xml:space="preserve"> under </w:t>
-      </w:r>
-      <w:r>
-        <w:rPr>
-          <w:rFonts w:ascii="Consolas" w:hAnsi="Consolas"/>
-          <w:color w:val="33443A"/>
-          <w:sz w:val="19"/>
-        </w:rPr>
-        <w:t>cropsense.history</w:t>
-      </w:r>
-      <w:r>
-        <w:t xml:space="preserve">, capped at 100 entries, with a 160 px thumbnail and the full text guidance but </w:t>
-      </w:r>
-      <w:r>
-        <w:rPr>
-          <w:i/>
-        </w:rPr>
-        <w:t>not</w:t>
-      </w:r>
-      <w:r>
-        <w:t xml:space="preserve"> the base64 Grad-CAM or the raw payload — those would blow the storage quota within a handful of records. History therefore works with no login, no database and no network.</w:t>
+        <w:t>A signed-in user’s checks are written to the predictions table in a hosted PostgreSQL (Neon, free tier, Singapore, reached over SSL), so they follow the farmer to another device. The web client also mirrors the account’s rows into localStorage under cropsense.history, capped at 100 entries with a 160 px thumbnail and the guidance text but not the base64 Grad-CAM — that would blow the quota within a handful of records — so filters, search and the detail view work without refetching. Deleting an entry removes both copies. /auth/history filters by the username inside the token and returns 403 for someone else’s row; both were tested against the live database. The Android client reads its history straight from the server and keeps no local copy.</w:t>
       </w:r>
     </w:p>
     <w:p>
@@ -8186,80 +8113,8 @@
                 <w:sz w:val="17"/>
               </w:rPr>
               <w:t>BE READY FOR THIS QUESTION</w:t>
-            </w:r>
-          </w:p>
-          <w:p>
-            <w:pPr>
-              <w:spacing w:after="0"/>
-            </w:pPr>
-            <w:r>
-              <w:rPr>
-                <w:rFonts w:ascii="Consolas" w:hAnsi="Consolas"/>
-                <w:color w:val="33443A"/>
-                <w:sz w:val="20"/>
-              </w:rPr>
-              <w:t>db_save_prediction(...)</w:t>
-            </w:r>
-            <w:r>
-              <w:rPr>
-                <w:sz w:val="20"/>
-              </w:rPr>
-              <w:t xml:space="preserve"> is </w:t>
-            </w:r>
-            <w:r>
-              <w:rPr>
-                <w:b/>
-                <w:sz w:val="20"/>
-              </w:rPr>
-              <w:t>commented out</w:t>
-            </w:r>
-            <w:r>
-              <w:rPr>
-                <w:sz w:val="20"/>
-              </w:rPr>
-              <w:t xml:space="preserve"> inside </w:t>
-            </w:r>
-            <w:r>
-              <w:rPr>
-                <w:rFonts w:ascii="Consolas" w:hAnsi="Consolas"/>
-                <w:color w:val="33443A"/>
-                <w:sz w:val="20"/>
-              </w:rPr>
-              <w:t>/predict</w:t>
-            </w:r>
-            <w:r>
-              <w:rPr>
-                <w:sz w:val="20"/>
-              </w:rPr>
-              <w:t xml:space="preserve">, and so is the </w:t>
-            </w:r>
-            <w:r>
-              <w:rPr>
-                <w:rFonts w:ascii="Consolas" w:hAnsi="Consolas"/>
-                <w:color w:val="33443A"/>
-                <w:sz w:val="20"/>
-              </w:rPr>
-              <w:t>Depends(get_current_user)</w:t>
-            </w:r>
-            <w:r>
-              <w:rPr>
-                <w:sz w:val="20"/>
-              </w:rPr>
-              <w:t xml:space="preserve"> parameter. That is why the endpoint needs no auth and no database — but it also means </w:t>
-            </w:r>
-            <w:r>
-              <w:rPr>
-                <w:rFonts w:ascii="Consolas" w:hAnsi="Consolas"/>
-                <w:color w:val="33443A"/>
-                <w:sz w:val="20"/>
-              </w:rPr>
-              <w:t>GET /auth/history</w:t>
-            </w:r>
-            <w:r>
-              <w:rPr>
-                <w:sz w:val="20"/>
-              </w:rPr>
-              <w:t xml:space="preserve"> will return an empty list on the running system, because nothing writes to the predictions table. The endpoint, the schema and the write function all work; they are simply not wired in. Present this as a deliberate consequence of the local-first design, not as an oversight, and be ready to uncomment the two lines if asked to show server-side history.</w:t>
+              <w:br/>
+              <w:t>Why does /predict still accept a request with no token, if sign-in is compulsory? Because the requirement belongs in the product, not in the inference path. The endpoint uses an optional bearer dependency, so an expired token degrades the experience to “this check was not saved” instead of losing a diagnosis the farmer already waited seven seconds for. Both clients enforce the gate, and every write to the database is wrapped so a database failure can never turn a successful prediction into an error.</w:t>
             </w:r>
           </w:p>
         </w:tc>
@@ -9549,7 +9404,7 @@
     </w:p>
     <w:p>
       <w:r>
-        <w:t>The frontend test suite runs green: 24 tests across 5 files, all passing (Vitest 3.2 + React Testing Library, jsdom). ESLint reports no problems and the production build succeeds. Coverage targets the logic most worth protecting rather than chasing a percentage:</w:t>
+        <w:t>The frontend test suite runs green: 28 tests across 6 files, all passing (Vitest 3.2 + React Testing Library, jsdom). ESLint reports no problems and the production build succeeds. Coverage targets the logic most worth protecting rather than chasing a percentage:</w:t>
       </w:r>
     </w:p>
     <w:tbl>
@@ -10507,21 +10362,7 @@
           <w:color w:val="33443A"/>
           <w:sz w:val="19"/>
         </w:rPr>
-        <w:t>JWT_SECRET</w:t>
-      </w:r>
-      <w:r>
-        <w:t xml:space="preserve"> falls back to a hardcoded default, and CORS is </w:t>
-      </w:r>
-      <w:r>
-        <w:rPr>
-          <w:rFonts w:ascii="Consolas" w:hAnsi="Consolas"/>
-          <w:color w:val="33443A"/>
-          <w:sz w:val="19"/>
-        </w:rPr>
-        <w:t>allow_origins=["*"]</w:t>
-      </w:r>
-      <w:r>
-        <w:t>. Both are fine for a demo and both must be tightened before any real deployment. Being able to say exactly that is better than being caught by it.</w:t>
+        <w:t>JWT_SECRET is now set as a Space secret and CORS is still allow_origins=["*"]. Tokens travel in the Authorization header rather than cookies, so an open CORS policy does not by itself expose a session, but it should be narrowed to the Vercel origin before any real deployment. There is also no rate limit on /auth/login yet.</w:t>
       </w:r>
     </w:p>
     <w:p>
@@ -10539,14 +10380,7 @@
           <w:color w:val="555F58"/>
           <w:sz w:val="17"/>
         </w:rPr>
-        <w:t xml:space="preserve">[By design]  </w:t>
-      </w:r>
-      <w:r>
-        <w:rPr>
-          <w:b/>
-          <w:sz w:val="21"/>
-        </w:rPr>
-        <w:t>Server-side history is not wired in</w:t>
+        <w:t>[Resolved] Server-side history is wired in</w:t>
       </w:r>
     </w:p>
     <w:p>
@@ -10560,32 +10394,7 @@
           <w:color w:val="33443A"/>
           <w:sz w:val="19"/>
         </w:rPr>
-        <w:t>db_save_prediction(...)</w:t>
-      </w:r>
-      <w:r>
-        <w:t xml:space="preserve"> is commented out in </w:t>
-      </w:r>
-      <w:r>
-        <w:rPr>
-          <w:rFonts w:ascii="Consolas" w:hAnsi="Consolas"/>
-          <w:color w:val="33443A"/>
-          <w:sz w:val="19"/>
-        </w:rPr>
-        <w:t>/predict</w:t>
-      </w:r>
-      <w:r>
-        <w:t xml:space="preserve">, so </w:t>
-      </w:r>
-      <w:r>
-        <w:rPr>
-          <w:rFonts w:ascii="Consolas" w:hAnsi="Consolas"/>
-          <w:color w:val="33443A"/>
-          <w:sz w:val="19"/>
-        </w:rPr>
-        <w:t>/auth/history</w:t>
-      </w:r>
-      <w:r>
-        <w:t xml:space="preserve"> returns empty. A consequence of the local-first architecture — two lines from working.</w:t>
+        <w:t>db_save_prediction(...) now runs for every authenticated /predict, and GET /auth/history returns that user’s rows from the hosted database. The earlier note that it was two lines from working is no longer a gap.</w:t>
       </w:r>
     </w:p>
     <w:p>
@@ -10968,14 +10777,7 @@
           <w:b/>
           <w:color w:val="1F5C38"/>
         </w:rPr>
-        <w:t xml:space="preserve">Q.  </w:t>
-      </w:r>
-      <w:r>
-        <w:rPr>
-          <w:b/>
-          <w:sz w:val="21"/>
-        </w:rPr>
-        <w:t>Why is there no login requirement?</w:t>
+        <w:t>Q.  Why is an account required, when the earlier design deliberately had none?</w:t>
       </w:r>
     </w:p>
     <w:p>
@@ -10984,40 +10786,7 @@
         <w:ind w:left="360"/>
       </w:pPr>
       <w:r>
-        <w:t xml:space="preserve">Because requiring an account to diagnose a leaf would be a product failure for the intended user. The diagnosis is the value, and it has no dependency on identity — so </w:t>
-      </w:r>
-      <w:r>
-        <w:rPr>
-          <w:rFonts w:ascii="Consolas" w:hAnsi="Consolas"/>
-          <w:color w:val="33443A"/>
-          <w:sz w:val="19"/>
-        </w:rPr>
-        <w:t>/predict</w:t>
-      </w:r>
-      <w:r>
-        <w:t xml:space="preserve"> takes no auth and touches no database, </w:t>
-      </w:r>
-      <w:r>
-        <w:rPr>
-          <w:rFonts w:ascii="Consolas" w:hAnsi="Consolas"/>
-          <w:color w:val="33443A"/>
-          <w:sz w:val="19"/>
-        </w:rPr>
-        <w:t>init_db()</w:t>
-      </w:r>
-      <w:r>
-        <w:t xml:space="preserve"> failure is caught and logged rather than fatal, and history lives in browser </w:t>
-      </w:r>
-      <w:r>
-        <w:rPr>
-          <w:rFonts w:ascii="Consolas" w:hAnsi="Consolas"/>
-          <w:color w:val="33443A"/>
-          <w:sz w:val="19"/>
-        </w:rPr>
-        <w:t>localStorage</w:t>
-      </w:r>
-      <w:r>
-        <w:t>. The whole system runs on a single container with no persistence layer. JWT auth, bcrypt and the Postgres schema are all implemented and working; accounts are genuinely additive rather than a gate.</w:t>
+        <w:t>Because a farmer who changes phone, or moves between the website and the app, loses everything under a device-only history — and the history is what turns one-off answers into a record of a season. The cost is real and I state it plainly: a sign-up step before the first photo is a barrier for the intended user, and it is the opposite trade-off from the earlier local-first design. What I kept from that design is that the inference path never depends on identity: /predict still answers without a token, so an expired session or a database outage cannot fail a diagnosis. Security-wise: bcrypt hashes, a 24-hour HS256 JWT, rows filtered by the username inside the token, and 403 on another user’s row.</w:t>
       </w:r>
     </w:p>
     <w:p>

</xml_diff>